<commit_message>
Add management/delivery/sales/POS pages, dashboard tests, and ER diagram
- New pages: CounterPOS, DeliveryIssues/Shift/Trips, MyTasks, SalesTasks,
  and Management screens (Approvals, CashReconciliation, DayPnl,
  DeliveriesAudit, Discounts, LiveOps, OrdersAudit, Refunds, StaffPerformance)
- Vitest setup + tests across Login, dashboards, and new pages
- Updated existing dashboards (Bakery, Delivery, Kitchen, Management, Sales)
  and api/endpoints
- ER diagram (er_diagram.png) and generator script
- Ignore *.sql to prevent committing DB dumps

Co-Authored-By: Claude Opus 4.7 (1M context) <noreply@anthropic.com>
</commit_message>
<xml_diff>
--- a/TABLES.docx
+++ b/TABLES.docx
@@ -39,12 +39,28 @@
     </w:p>
     <w:p>
       <w:r>
-        <w:t>Id BIGINT PRIMARY KEY IDENTITY(1,1),</w:t>
-      </w:r>
-    </w:p>
-    <w:p>
-      <w:r>
-        <w:t>name VARCHAR(50) NOT NULL</w:t>
+        <w:t xml:space="preserve">Id BIGINT PRIMARY KEY </w:t>
+      </w:r>
+      <w:proofErr w:type="gramStart"/>
+      <w:r>
+        <w:t>IDENTITY(</w:t>
+      </w:r>
+      <w:proofErr w:type="gramEnd"/>
+      <w:r>
+        <w:t>1,1),</w:t>
+      </w:r>
+    </w:p>
+    <w:p>
+      <w:r>
+        <w:t xml:space="preserve">name </w:t>
+      </w:r>
+      <w:proofErr w:type="gramStart"/>
+      <w:r>
+        <w:t>VARCHAR(</w:t>
+      </w:r>
+      <w:proofErr w:type="gramEnd"/>
+      <w:r>
+        <w:t>50) NOT NULL</w:t>
       </w:r>
     </w:p>
     <w:p>
@@ -59,22 +75,54 @@
     </w:p>
     <w:p>
       <w:r>
-        <w:t xml:space="preserve">    Id BIGINT PRIMARY KEY IDENTITY(1,1),</w:t>
-      </w:r>
-    </w:p>
-    <w:p>
-      <w:r>
-        <w:t xml:space="preserve">    Name VARCHAR(100),</w:t>
-      </w:r>
-    </w:p>
-    <w:p>
-      <w:r>
-        <w:t xml:space="preserve">    Email VARCHAR(100) UNIQUE,</w:t>
-      </w:r>
-    </w:p>
-    <w:p>
-      <w:r>
-        <w:t xml:space="preserve">    Password VARCHAR(255),</w:t>
+        <w:t xml:space="preserve">    Id BIGINT PRIMARY KEY </w:t>
+      </w:r>
+      <w:proofErr w:type="gramStart"/>
+      <w:r>
+        <w:t>IDENTITY(</w:t>
+      </w:r>
+      <w:proofErr w:type="gramEnd"/>
+      <w:r>
+        <w:t>1,1),</w:t>
+      </w:r>
+    </w:p>
+    <w:p>
+      <w:r>
+        <w:t xml:space="preserve">    Name </w:t>
+      </w:r>
+      <w:proofErr w:type="gramStart"/>
+      <w:r>
+        <w:t>VARCHAR(</w:t>
+      </w:r>
+      <w:proofErr w:type="gramEnd"/>
+      <w:r>
+        <w:t>100),</w:t>
+      </w:r>
+    </w:p>
+    <w:p>
+      <w:r>
+        <w:t xml:space="preserve">    Email </w:t>
+      </w:r>
+      <w:proofErr w:type="gramStart"/>
+      <w:r>
+        <w:t>VARCHAR(</w:t>
+      </w:r>
+      <w:proofErr w:type="gramEnd"/>
+      <w:r>
+        <w:t>100) UNIQUE,</w:t>
+      </w:r>
+    </w:p>
+    <w:p>
+      <w:r>
+        <w:t xml:space="preserve">    Password </w:t>
+      </w:r>
+      <w:proofErr w:type="gramStart"/>
+      <w:r>
+        <w:t>VARCHAR(</w:t>
+      </w:r>
+      <w:proofErr w:type="gramEnd"/>
+      <w:r>
+        <w:t>255),</w:t>
       </w:r>
     </w:p>
     <w:p>
@@ -87,7 +135,15 @@
       </w:r>
       <w:proofErr w:type="spellEnd"/>
       <w:r>
-        <w:t xml:space="preserve"> DATETIME2 DEFAULT GETDATE()</w:t>
+        <w:t xml:space="preserve"> DATETIME2 DEFAULT </w:t>
+      </w:r>
+      <w:proofErr w:type="gramStart"/>
+      <w:r>
+        <w:t>GETDATE(</w:t>
+      </w:r>
+      <w:proofErr w:type="gramEnd"/>
+      <w:r>
+        <w:t>)</w:t>
       </w:r>
     </w:p>
     <w:p>
@@ -122,22 +178,54 @@
           <w:b/>
           <w:bCs/>
         </w:rPr>
-        <w:t>values ('Pinky Jain','pinky@example.com','Pinky_123'),</w:t>
-      </w:r>
-    </w:p>
-    <w:p>
-      <w:pPr>
-        <w:rPr>
-          <w:b/>
-          <w:bCs/>
-        </w:rPr>
-      </w:pPr>
-      <w:r>
-        <w:rPr>
-          <w:b/>
-          <w:bCs/>
-        </w:rPr>
-        <w:t xml:space="preserve">     ('Kunal Sharma','kunal12@example.com','Love_To_Day');</w:t>
+        <w:t>values ('Pinky Jain</w:t>
+      </w:r>
+      <w:proofErr w:type="gramStart"/>
+      <w:r>
+        <w:rPr>
+          <w:b/>
+          <w:bCs/>
+        </w:rPr>
+        <w:t>','pinky@example.com</w:t>
+      </w:r>
+      <w:proofErr w:type="gramEnd"/>
+      <w:r>
+        <w:rPr>
+          <w:b/>
+          <w:bCs/>
+        </w:rPr>
+        <w:t>','Pinky_123'),</w:t>
+      </w:r>
+    </w:p>
+    <w:p>
+      <w:pPr>
+        <w:rPr>
+          <w:b/>
+          <w:bCs/>
+        </w:rPr>
+      </w:pPr>
+      <w:r>
+        <w:rPr>
+          <w:b/>
+          <w:bCs/>
+        </w:rPr>
+        <w:t xml:space="preserve">     ('Kunal Sharma</w:t>
+      </w:r>
+      <w:proofErr w:type="gramStart"/>
+      <w:r>
+        <w:rPr>
+          <w:b/>
+          <w:bCs/>
+        </w:rPr>
+        <w:t>','kunal12@example.com</w:t>
+      </w:r>
+      <w:proofErr w:type="gramEnd"/>
+      <w:r>
+        <w:rPr>
+          <w:b/>
+          <w:bCs/>
+        </w:rPr>
+        <w:t>','Love_To_Day');</w:t>
       </w:r>
     </w:p>
     <w:p/>
@@ -227,7 +315,15 @@
       </w:r>
       <w:proofErr w:type="spellEnd"/>
       <w:r>
-        <w:t>) REFERENCES Users(Id),</w:t>
+        <w:t xml:space="preserve">) REFERENCES </w:t>
+      </w:r>
+      <w:proofErr w:type="gramStart"/>
+      <w:r>
+        <w:t>Users(</w:t>
+      </w:r>
+      <w:proofErr w:type="gramEnd"/>
+      <w:r>
+        <w:t>Id),</w:t>
       </w:r>
     </w:p>
     <w:p>
@@ -249,7 +345,15 @@
       </w:r>
       <w:proofErr w:type="spellEnd"/>
       <w:r>
-        <w:t>) REFERENCES Roles(Id)</w:t>
+        <w:t xml:space="preserve">) REFERENCES </w:t>
+      </w:r>
+      <w:proofErr w:type="gramStart"/>
+      <w:r>
+        <w:t>Roles(</w:t>
+      </w:r>
+      <w:proofErr w:type="gramEnd"/>
+      <w:r>
+        <w:t>Id)</w:t>
       </w:r>
     </w:p>
     <w:p>
@@ -308,12 +412,28 @@
     </w:p>
     <w:p>
       <w:r>
-        <w:t xml:space="preserve">    Id BIGINT PRIMARY KEY IDENTITY(1,1),</w:t>
-      </w:r>
-    </w:p>
-    <w:p>
-      <w:r>
-        <w:t xml:space="preserve">    Name VARCHAR(100),</w:t>
+        <w:t xml:space="preserve">    Id BIGINT PRIMARY KEY </w:t>
+      </w:r>
+      <w:proofErr w:type="gramStart"/>
+      <w:r>
+        <w:t>IDENTITY(</w:t>
+      </w:r>
+      <w:proofErr w:type="gramEnd"/>
+      <w:r>
+        <w:t>1,1),</w:t>
+      </w:r>
+    </w:p>
+    <w:p>
+      <w:r>
+        <w:t xml:space="preserve">    Name </w:t>
+      </w:r>
+      <w:proofErr w:type="gramStart"/>
+      <w:r>
+        <w:t>VARCHAR(</w:t>
+      </w:r>
+      <w:proofErr w:type="gramEnd"/>
+      <w:r>
+        <w:t>100),</w:t>
       </w:r>
     </w:p>
     <w:p>
@@ -517,12 +637,28 @@
     </w:p>
     <w:p>
       <w:r>
-        <w:t xml:space="preserve">    Id BIGINT PRIMARY KEY IDENTITY(1,1),</w:t>
-      </w:r>
-    </w:p>
-    <w:p>
-      <w:r>
-        <w:t xml:space="preserve">    Name VARCHAR(150),</w:t>
+        <w:t xml:space="preserve">    Id BIGINT PRIMARY KEY </w:t>
+      </w:r>
+      <w:proofErr w:type="gramStart"/>
+      <w:r>
+        <w:t>IDENTITY(</w:t>
+      </w:r>
+      <w:proofErr w:type="gramEnd"/>
+      <w:r>
+        <w:t>1,1),</w:t>
+      </w:r>
+    </w:p>
+    <w:p>
+      <w:r>
+        <w:t xml:space="preserve">    Name </w:t>
+      </w:r>
+      <w:proofErr w:type="gramStart"/>
+      <w:r>
+        <w:t>VARCHAR(</w:t>
+      </w:r>
+      <w:proofErr w:type="gramEnd"/>
+      <w:r>
+        <w:t>150),</w:t>
       </w:r>
     </w:p>
     <w:p>
@@ -532,7 +668,15 @@
     </w:p>
     <w:p>
       <w:r>
-        <w:t xml:space="preserve">    Price DECIMAL(10,2),</w:t>
+        <w:t xml:space="preserve">    Price </w:t>
+      </w:r>
+      <w:proofErr w:type="gramStart"/>
+      <w:r>
+        <w:t>DECIMAL(</w:t>
+      </w:r>
+      <w:proofErr w:type="gramEnd"/>
+      <w:r>
+        <w:t>10,2),</w:t>
       </w:r>
     </w:p>
     <w:p>
@@ -564,7 +708,15 @@
       </w:r>
       <w:proofErr w:type="spellEnd"/>
       <w:r>
-        <w:t xml:space="preserve"> DATETIME2 DEFAULT GETDATE(),</w:t>
+        <w:t xml:space="preserve"> DATETIME2 DEFAULT </w:t>
+      </w:r>
+      <w:proofErr w:type="gramStart"/>
+      <w:r>
+        <w:t>GETDATE(</w:t>
+      </w:r>
+      <w:proofErr w:type="gramEnd"/>
+      <w:r>
+        <w:t>),</w:t>
       </w:r>
     </w:p>
     <w:p>
@@ -577,7 +729,15 @@
       </w:r>
       <w:proofErr w:type="spellEnd"/>
       <w:r>
-        <w:t>) REFERENCES Categories(Id)</w:t>
+        <w:t xml:space="preserve">) REFERENCES </w:t>
+      </w:r>
+      <w:proofErr w:type="gramStart"/>
+      <w:r>
+        <w:t>Categories(</w:t>
+      </w:r>
+      <w:proofErr w:type="gramEnd"/>
+      <w:r>
+        <w:t>Id)</w:t>
       </w:r>
     </w:p>
     <w:p>
@@ -628,22 +788,54 @@
           <w:b/>
           <w:bCs/>
         </w:rPr>
-        <w:t>('Apple', 'Daily An Apple Keeps Doctor Away', 1.00, 10, 1),</w:t>
-      </w:r>
-    </w:p>
-    <w:p>
-      <w:pPr>
-        <w:rPr>
-          <w:b/>
-          <w:bCs/>
-        </w:rPr>
-      </w:pPr>
-      <w:r>
-        <w:rPr>
-          <w:b/>
-          <w:bCs/>
-        </w:rPr>
-        <w:t>('Apple', 'Daily An Apple Keeps Doctor Away', 0.59, 20, 2),</w:t>
+        <w:t xml:space="preserve">('Apple', 'Daily </w:t>
+      </w:r>
+      <w:proofErr w:type="gramStart"/>
+      <w:r>
+        <w:rPr>
+          <w:b/>
+          <w:bCs/>
+        </w:rPr>
+        <w:t>An</w:t>
+      </w:r>
+      <w:proofErr w:type="gramEnd"/>
+      <w:r>
+        <w:rPr>
+          <w:b/>
+          <w:bCs/>
+        </w:rPr>
+        <w:t xml:space="preserve"> Apple Keeps Doctor Away', 1.00, 10, 1),</w:t>
+      </w:r>
+    </w:p>
+    <w:p>
+      <w:pPr>
+        <w:rPr>
+          <w:b/>
+          <w:bCs/>
+        </w:rPr>
+      </w:pPr>
+      <w:r>
+        <w:rPr>
+          <w:b/>
+          <w:bCs/>
+        </w:rPr>
+        <w:t xml:space="preserve">('Apple', 'Daily </w:t>
+      </w:r>
+      <w:proofErr w:type="gramStart"/>
+      <w:r>
+        <w:rPr>
+          <w:b/>
+          <w:bCs/>
+        </w:rPr>
+        <w:t>An</w:t>
+      </w:r>
+      <w:proofErr w:type="gramEnd"/>
+      <w:r>
+        <w:rPr>
+          <w:b/>
+          <w:bCs/>
+        </w:rPr>
+        <w:t xml:space="preserve"> Apple Keeps Doctor Away', 0.59, 20, 2),</w:t>
       </w:r>
     </w:p>
     <w:p>
@@ -688,22 +880,54 @@
           <w:b/>
           <w:bCs/>
         </w:rPr>
-        <w:t>('Carrot', 'Great For Eyes', 0.10, 50, 3),</w:t>
-      </w:r>
-    </w:p>
-    <w:p>
-      <w:pPr>
-        <w:rPr>
-          <w:b/>
-          <w:bCs/>
-        </w:rPr>
-      </w:pPr>
-      <w:r>
-        <w:rPr>
-          <w:b/>
-          <w:bCs/>
-        </w:rPr>
-        <w:t>('Broccoli', 'Good For Health', 0.05, 10, 3),</w:t>
+        <w:t xml:space="preserve">('Carrot', 'Great </w:t>
+      </w:r>
+      <w:proofErr w:type="gramStart"/>
+      <w:r>
+        <w:rPr>
+          <w:b/>
+          <w:bCs/>
+        </w:rPr>
+        <w:t>For</w:t>
+      </w:r>
+      <w:proofErr w:type="gramEnd"/>
+      <w:r>
+        <w:rPr>
+          <w:b/>
+          <w:bCs/>
+        </w:rPr>
+        <w:t xml:space="preserve"> Eyes', 0.10, 50, 3),</w:t>
+      </w:r>
+    </w:p>
+    <w:p>
+      <w:pPr>
+        <w:rPr>
+          <w:b/>
+          <w:bCs/>
+        </w:rPr>
+      </w:pPr>
+      <w:r>
+        <w:rPr>
+          <w:b/>
+          <w:bCs/>
+        </w:rPr>
+        <w:t xml:space="preserve">('Broccoli', 'Good </w:t>
+      </w:r>
+      <w:proofErr w:type="gramStart"/>
+      <w:r>
+        <w:rPr>
+          <w:b/>
+          <w:bCs/>
+        </w:rPr>
+        <w:t>For</w:t>
+      </w:r>
+      <w:proofErr w:type="gramEnd"/>
+      <w:r>
+        <w:rPr>
+          <w:b/>
+          <w:bCs/>
+        </w:rPr>
+        <w:t xml:space="preserve"> Health', 0.05, 10, 3),</w:t>
       </w:r>
     </w:p>
     <w:p>
@@ -733,7 +957,23 @@
           <w:b/>
           <w:bCs/>
         </w:rPr>
-        <w:t>('bitter Gourd', 'Bitter But Better', 1.00, 15, 4),</w:t>
+        <w:t xml:space="preserve">('bitter Gourd', 'Bitter </w:t>
+      </w:r>
+      <w:proofErr w:type="gramStart"/>
+      <w:r>
+        <w:rPr>
+          <w:b/>
+          <w:bCs/>
+        </w:rPr>
+        <w:t>But</w:t>
+      </w:r>
+      <w:proofErr w:type="gramEnd"/>
+      <w:r>
+        <w:rPr>
+          <w:b/>
+          <w:bCs/>
+        </w:rPr>
+        <w:t xml:space="preserve"> Better', 1.00, 15, 4),</w:t>
       </w:r>
     </w:p>
     <w:p>
@@ -763,7 +1003,23 @@
           <w:b/>
           <w:bCs/>
         </w:rPr>
-        <w:t>('Milk', 'Great For Eyes', 5.00, 12, 5),</w:t>
+        <w:t xml:space="preserve">('Milk', 'Great </w:t>
+      </w:r>
+      <w:proofErr w:type="gramStart"/>
+      <w:r>
+        <w:rPr>
+          <w:b/>
+          <w:bCs/>
+        </w:rPr>
+        <w:t>For</w:t>
+      </w:r>
+      <w:proofErr w:type="gramEnd"/>
+      <w:r>
+        <w:rPr>
+          <w:b/>
+          <w:bCs/>
+        </w:rPr>
+        <w:t xml:space="preserve"> Eyes', 5.00, 12, 5),</w:t>
       </w:r>
     </w:p>
     <w:p>
@@ -844,7 +1100,15 @@
     </w:p>
     <w:p>
       <w:r>
-        <w:t xml:space="preserve">    Id BIGINT PRIMARY KEY IDENTITY(1,1),</w:t>
+        <w:t xml:space="preserve">    Id BIGINT PRIMARY KEY </w:t>
+      </w:r>
+      <w:proofErr w:type="gramStart"/>
+      <w:r>
+        <w:t>IDENTITY(</w:t>
+      </w:r>
+      <w:proofErr w:type="gramEnd"/>
+      <w:r>
+        <w:t>1,1),</w:t>
       </w:r>
     </w:p>
     <w:p>
@@ -870,7 +1134,15 @@
       </w:r>
       <w:proofErr w:type="spellEnd"/>
       <w:r>
-        <w:t xml:space="preserve"> VARCHAR(255),</w:t>
+        <w:t xml:space="preserve"> </w:t>
+      </w:r>
+      <w:proofErr w:type="gramStart"/>
+      <w:r>
+        <w:t>VARCHAR(</w:t>
+      </w:r>
+      <w:proofErr w:type="gramEnd"/>
+      <w:r>
+        <w:t>255),</w:t>
       </w:r>
     </w:p>
     <w:p>
@@ -883,7 +1155,15 @@
       </w:r>
       <w:proofErr w:type="spellEnd"/>
       <w:r>
-        <w:t>) REFERENCES Products(Id)</w:t>
+        <w:t xml:space="preserve">) REFERENCES </w:t>
+      </w:r>
+      <w:proofErr w:type="gramStart"/>
+      <w:r>
+        <w:t>Products(</w:t>
+      </w:r>
+      <w:proofErr w:type="gramEnd"/>
+      <w:r>
+        <w:t>Id)</w:t>
       </w:r>
     </w:p>
     <w:p>
@@ -1154,7 +1434,15 @@
     </w:p>
     <w:p>
       <w:r>
-        <w:t xml:space="preserve">    Id BIGINT PRIMARY KEY IDENTITY(1,1),</w:t>
+        <w:t xml:space="preserve">    Id BIGINT PRIMARY KEY </w:t>
+      </w:r>
+      <w:proofErr w:type="gramStart"/>
+      <w:r>
+        <w:t>IDENTITY(</w:t>
+      </w:r>
+      <w:proofErr w:type="gramEnd"/>
+      <w:r>
+        <w:t>1,1),</w:t>
       </w:r>
     </w:p>
     <w:p>
@@ -1180,7 +1468,15 @@
       </w:r>
       <w:proofErr w:type="spellEnd"/>
       <w:r>
-        <w:t xml:space="preserve"> DATETIME2 DEFAULT GETDATE(),</w:t>
+        <w:t xml:space="preserve"> DATETIME2 DEFAULT </w:t>
+      </w:r>
+      <w:proofErr w:type="gramStart"/>
+      <w:r>
+        <w:t>GETDATE(</w:t>
+      </w:r>
+      <w:proofErr w:type="gramEnd"/>
+      <w:r>
+        <w:t>),</w:t>
       </w:r>
     </w:p>
     <w:p>
@@ -1193,7 +1489,15 @@
       </w:r>
       <w:proofErr w:type="spellEnd"/>
       <w:r>
-        <w:t>) REFERENCES Users(Id)</w:t>
+        <w:t xml:space="preserve">) REFERENCES </w:t>
+      </w:r>
+      <w:proofErr w:type="gramStart"/>
+      <w:r>
+        <w:t>Users(</w:t>
+      </w:r>
+      <w:proofErr w:type="gramEnd"/>
+      <w:r>
+        <w:t>Id)</w:t>
       </w:r>
     </w:p>
     <w:p>
@@ -1250,7 +1554,15 @@
     </w:p>
     <w:p>
       <w:r>
-        <w:t xml:space="preserve">    Id BIGINT PRIMARY KEY IDENTITY(1,1),</w:t>
+        <w:t xml:space="preserve">    Id BIGINT PRIMARY KEY </w:t>
+      </w:r>
+      <w:proofErr w:type="gramStart"/>
+      <w:r>
+        <w:t>IDENTITY(</w:t>
+      </w:r>
+      <w:proofErr w:type="gramEnd"/>
+      <w:r>
+        <w:t>1,1),</w:t>
       </w:r>
     </w:p>
     <w:p>
@@ -1295,7 +1607,15 @@
       </w:r>
       <w:proofErr w:type="spellEnd"/>
       <w:r>
-        <w:t>) REFERENCES Cart(Id),</w:t>
+        <w:t xml:space="preserve">) REFERENCES </w:t>
+      </w:r>
+      <w:proofErr w:type="gramStart"/>
+      <w:r>
+        <w:t>Cart(</w:t>
+      </w:r>
+      <w:proofErr w:type="gramEnd"/>
+      <w:r>
+        <w:t>Id),</w:t>
       </w:r>
     </w:p>
     <w:p>
@@ -1308,7 +1628,15 @@
       </w:r>
       <w:proofErr w:type="spellEnd"/>
       <w:r>
-        <w:t>) REFERENCES Products(Id)</w:t>
+        <w:t xml:space="preserve">) REFERENCES </w:t>
+      </w:r>
+      <w:proofErr w:type="gramStart"/>
+      <w:r>
+        <w:t>Products(</w:t>
+      </w:r>
+      <w:proofErr w:type="gramEnd"/>
+      <w:r>
+        <w:t>Id)</w:t>
       </w:r>
     </w:p>
     <w:p>
@@ -1469,7 +1797,15 @@
     </w:p>
     <w:p>
       <w:r>
-        <w:t xml:space="preserve">    Id BIGINT PRIMARY KEY IDENTITY(1,1),</w:t>
+        <w:t xml:space="preserve">    Id BIGINT PRIMARY KEY </w:t>
+      </w:r>
+      <w:proofErr w:type="gramStart"/>
+      <w:r>
+        <w:t>IDENTITY(</w:t>
+      </w:r>
+      <w:proofErr w:type="gramEnd"/>
+      <w:r>
+        <w:t>1,1),</w:t>
       </w:r>
       <w:r>
         <w:tab/>
@@ -1498,12 +1834,28 @@
       </w:r>
       <w:proofErr w:type="spellEnd"/>
       <w:r>
-        <w:t xml:space="preserve"> DECIMAL(10,2),</w:t>
-      </w:r>
-    </w:p>
-    <w:p>
-      <w:r>
-        <w:t xml:space="preserve">    Status VARCHAR(50),</w:t>
+        <w:t xml:space="preserve"> </w:t>
+      </w:r>
+      <w:proofErr w:type="gramStart"/>
+      <w:r>
+        <w:t>DECIMAL(</w:t>
+      </w:r>
+      <w:proofErr w:type="gramEnd"/>
+      <w:r>
+        <w:t>10,2),</w:t>
+      </w:r>
+    </w:p>
+    <w:p>
+      <w:r>
+        <w:t xml:space="preserve">    Status </w:t>
+      </w:r>
+      <w:proofErr w:type="gramStart"/>
+      <w:r>
+        <w:t>VARCHAR(</w:t>
+      </w:r>
+      <w:proofErr w:type="gramEnd"/>
+      <w:r>
+        <w:t>50),</w:t>
       </w:r>
     </w:p>
     <w:p>
@@ -1516,7 +1868,15 @@
       </w:r>
       <w:proofErr w:type="spellEnd"/>
       <w:r>
-        <w:t xml:space="preserve"> DATETIME2 DEFAULT GETDATE(),</w:t>
+        <w:t xml:space="preserve"> DATETIME2 DEFAULT </w:t>
+      </w:r>
+      <w:proofErr w:type="gramStart"/>
+      <w:r>
+        <w:t>GETDATE(</w:t>
+      </w:r>
+      <w:proofErr w:type="gramEnd"/>
+      <w:r>
+        <w:t>),</w:t>
       </w:r>
     </w:p>
     <w:p>
@@ -1529,7 +1889,15 @@
       </w:r>
       <w:proofErr w:type="spellEnd"/>
       <w:r>
-        <w:t>) REFERENCES Users(Id)</w:t>
+        <w:t xml:space="preserve">) REFERENCES </w:t>
+      </w:r>
+      <w:proofErr w:type="gramStart"/>
+      <w:r>
+        <w:t>Users(</w:t>
+      </w:r>
+      <w:proofErr w:type="gramEnd"/>
+      <w:r>
+        <w:t>Id)</w:t>
       </w:r>
     </w:p>
     <w:p>
@@ -1616,7 +1984,15 @@
     </w:p>
     <w:p>
       <w:r>
-        <w:t xml:space="preserve">    Id BIGINT PRIMARY KEY IDENTITY(1,1),</w:t>
+        <w:t xml:space="preserve">    Id BIGINT PRIMARY KEY </w:t>
+      </w:r>
+      <w:proofErr w:type="gramStart"/>
+      <w:r>
+        <w:t>IDENTITY(</w:t>
+      </w:r>
+      <w:proofErr w:type="gramEnd"/>
+      <w:r>
+        <w:t>1,1),</w:t>
       </w:r>
     </w:p>
     <w:p>
@@ -1652,7 +2028,15 @@
     </w:p>
     <w:p>
       <w:r>
-        <w:t xml:space="preserve">    Price DECIMAL(10,2),</w:t>
+        <w:t xml:space="preserve">    Price </w:t>
+      </w:r>
+      <w:proofErr w:type="gramStart"/>
+      <w:r>
+        <w:t>DECIMAL(</w:t>
+      </w:r>
+      <w:proofErr w:type="gramEnd"/>
+      <w:r>
+        <w:t>10,2),</w:t>
       </w:r>
     </w:p>
     <w:p>
@@ -1665,7 +2049,15 @@
       </w:r>
       <w:proofErr w:type="spellEnd"/>
       <w:r>
-        <w:t>) REFERENCES Orders(Id),</w:t>
+        <w:t xml:space="preserve">) REFERENCES </w:t>
+      </w:r>
+      <w:proofErr w:type="gramStart"/>
+      <w:r>
+        <w:t>Orders(</w:t>
+      </w:r>
+      <w:proofErr w:type="gramEnd"/>
+      <w:r>
+        <w:t>Id),</w:t>
       </w:r>
     </w:p>
     <w:p>
@@ -1678,7 +2070,15 @@
       </w:r>
       <w:proofErr w:type="spellEnd"/>
       <w:r>
-        <w:t>) REFERENCES Products(Id)</w:t>
+        <w:t xml:space="preserve">) REFERENCES </w:t>
+      </w:r>
+      <w:proofErr w:type="gramStart"/>
+      <w:r>
+        <w:t>Products(</w:t>
+      </w:r>
+      <w:proofErr w:type="gramEnd"/>
+      <w:r>
+        <w:t>Id)</w:t>
       </w:r>
     </w:p>
     <w:p>
@@ -1827,7 +2227,15 @@
     </w:p>
     <w:p>
       <w:r>
-        <w:t xml:space="preserve">    Id BIGINT PRIMARY KEY IDENTITY(1,1),</w:t>
+        <w:t xml:space="preserve">    Id BIGINT PRIMARY KEY </w:t>
+      </w:r>
+      <w:proofErr w:type="gramStart"/>
+      <w:r>
+        <w:t>IDENTITY(</w:t>
+      </w:r>
+      <w:proofErr w:type="gramEnd"/>
+      <w:r>
+        <w:t>1,1),</w:t>
       </w:r>
     </w:p>
     <w:p>
@@ -1853,17 +2261,41 @@
       </w:r>
       <w:proofErr w:type="spellEnd"/>
       <w:r>
-        <w:t xml:space="preserve"> VARCHAR(50),</w:t>
-      </w:r>
-    </w:p>
-    <w:p>
-      <w:r>
-        <w:t xml:space="preserve">    Status VARCHAR(50),</w:t>
-      </w:r>
-    </w:p>
-    <w:p>
-      <w:r>
-        <w:t xml:space="preserve">    Amount DECIMAL(10,2),</w:t>
+        <w:t xml:space="preserve"> </w:t>
+      </w:r>
+      <w:proofErr w:type="gramStart"/>
+      <w:r>
+        <w:t>VARCHAR(</w:t>
+      </w:r>
+      <w:proofErr w:type="gramEnd"/>
+      <w:r>
+        <w:t>50),</w:t>
+      </w:r>
+    </w:p>
+    <w:p>
+      <w:r>
+        <w:t xml:space="preserve">    Status </w:t>
+      </w:r>
+      <w:proofErr w:type="gramStart"/>
+      <w:r>
+        <w:t>VARCHAR(</w:t>
+      </w:r>
+      <w:proofErr w:type="gramEnd"/>
+      <w:r>
+        <w:t>50),</w:t>
+      </w:r>
+    </w:p>
+    <w:p>
+      <w:r>
+        <w:t xml:space="preserve">    Amount </w:t>
+      </w:r>
+      <w:proofErr w:type="gramStart"/>
+      <w:r>
+        <w:t>DECIMAL(</w:t>
+      </w:r>
+      <w:proofErr w:type="gramEnd"/>
+      <w:r>
+        <w:t>10,2),</w:t>
       </w:r>
     </w:p>
     <w:p>
@@ -1876,7 +2308,15 @@
       </w:r>
       <w:proofErr w:type="spellEnd"/>
       <w:r>
-        <w:t xml:space="preserve"> DATETIME2 DEFAULT GETDATE(),</w:t>
+        <w:t xml:space="preserve"> DATETIME2 DEFAULT </w:t>
+      </w:r>
+      <w:proofErr w:type="gramStart"/>
+      <w:r>
+        <w:t>GETDATE(</w:t>
+      </w:r>
+      <w:proofErr w:type="gramEnd"/>
+      <w:r>
+        <w:t>),</w:t>
       </w:r>
     </w:p>
     <w:p>
@@ -1889,7 +2329,15 @@
       </w:r>
       <w:proofErr w:type="spellEnd"/>
       <w:r>
-        <w:t>) REFERENCES Orders(Id)</w:t>
+        <w:t xml:space="preserve">) REFERENCES </w:t>
+      </w:r>
+      <w:proofErr w:type="gramStart"/>
+      <w:r>
+        <w:t>Orders(</w:t>
+      </w:r>
+      <w:proofErr w:type="gramEnd"/>
+      <w:r>
+        <w:t>Id)</w:t>
       </w:r>
     </w:p>
     <w:p>
@@ -2015,17 +2463,41 @@
     </w:p>
     <w:p>
       <w:r>
-        <w:t xml:space="preserve">    "Name" VARCHAR(100),</w:t>
-      </w:r>
-    </w:p>
-    <w:p>
-      <w:r>
-        <w:t xml:space="preserve">    "Email" VARCHAR(100),</w:t>
-      </w:r>
-    </w:p>
-    <w:p>
-      <w:r>
-        <w:t xml:space="preserve">    "Password" VARCHAR(100),</w:t>
+        <w:t xml:space="preserve">    "Name" </w:t>
+      </w:r>
+      <w:proofErr w:type="gramStart"/>
+      <w:r>
+        <w:t>VARCHAR(</w:t>
+      </w:r>
+      <w:proofErr w:type="gramEnd"/>
+      <w:r>
+        <w:t>100),</w:t>
+      </w:r>
+    </w:p>
+    <w:p>
+      <w:r>
+        <w:t xml:space="preserve">    "Email" </w:t>
+      </w:r>
+      <w:proofErr w:type="gramStart"/>
+      <w:r>
+        <w:t>VARCHAR(</w:t>
+      </w:r>
+      <w:proofErr w:type="gramEnd"/>
+      <w:r>
+        <w:t>100),</w:t>
+      </w:r>
+    </w:p>
+    <w:p>
+      <w:r>
+        <w:t xml:space="preserve">    "Password" </w:t>
+      </w:r>
+      <w:proofErr w:type="gramStart"/>
+      <w:r>
+        <w:t>VARCHAR(</w:t>
+      </w:r>
+      <w:proofErr w:type="gramEnd"/>
+      <w:r>
+        <w:t>100),</w:t>
       </w:r>
     </w:p>
     <w:p>
@@ -2061,8 +2533,21 @@
       </w:r>
     </w:p>
     <w:p>
-      <w:r>
-        <w:t>VALUES('Kunal Sharma','kunal12@example.com','Love_To_Day');</w:t>
+      <w:proofErr w:type="gramStart"/>
+      <w:r>
+        <w:t>VALUES(</w:t>
+      </w:r>
+      <w:proofErr w:type="gramEnd"/>
+      <w:r>
+        <w:t>'Kunal Sharma</w:t>
+      </w:r>
+      <w:proofErr w:type="gramStart"/>
+      <w:r>
+        <w:t>','kunal12@example.com</w:t>
+      </w:r>
+      <w:proofErr w:type="gramEnd"/>
+      <w:r>
+        <w:t>','Love_To_Day');</w:t>
       </w:r>
     </w:p>
     <w:p/>
@@ -2092,7 +2577,15 @@
     </w:p>
     <w:p>
       <w:r>
-        <w:t xml:space="preserve">    name        VARCHAR(100),</w:t>
+        <w:t xml:space="preserve">    name        </w:t>
+      </w:r>
+      <w:proofErr w:type="gramStart"/>
+      <w:r>
+        <w:t>VARCHAR(</w:t>
+      </w:r>
+      <w:proofErr w:type="gramEnd"/>
+      <w:r>
+        <w:t>100),</w:t>
       </w:r>
     </w:p>
     <w:p>
@@ -2114,12 +2607,28 @@
     <w:p>
       <w:r>
         <w:lastRenderedPageBreak/>
-        <w:t xml:space="preserve">    ('Fruit',          'Fresh Organic Fruits'),</w:t>
-      </w:r>
-    </w:p>
-    <w:p>
-      <w:r>
-        <w:t xml:space="preserve">    ('Fruit',          'Fresh Fruits'),</w:t>
+        <w:t xml:space="preserve">    ('Fruit</w:t>
+      </w:r>
+      <w:proofErr w:type="gramStart"/>
+      <w:r>
+        <w:t xml:space="preserve">',   </w:t>
+      </w:r>
+      <w:proofErr w:type="gramEnd"/>
+      <w:r>
+        <w:t xml:space="preserve">       'Fresh Organic Fruits'),</w:t>
+      </w:r>
+    </w:p>
+    <w:p>
+      <w:r>
+        <w:t xml:space="preserve">    ('Fruit</w:t>
+      </w:r>
+      <w:proofErr w:type="gramStart"/>
+      <w:r>
+        <w:t xml:space="preserve">',   </w:t>
+      </w:r>
+      <w:proofErr w:type="gramEnd"/>
+      <w:r>
+        <w:t xml:space="preserve">       'Fresh Fruits'),</w:t>
       </w:r>
     </w:p>
     <w:p>
@@ -2131,8 +2640,13 @@
         <w:t>Vegitables</w:t>
       </w:r>
       <w:proofErr w:type="spellEnd"/>
-      <w:r>
-        <w:t>',     'Fresh Organic Veggies'),</w:t>
+      <w:proofErr w:type="gramStart"/>
+      <w:r>
+        <w:t xml:space="preserve">',   </w:t>
+      </w:r>
+      <w:proofErr w:type="gramEnd"/>
+      <w:r>
+        <w:t xml:space="preserve">  'Fresh Organic Veggies'),</w:t>
       </w:r>
     </w:p>
     <w:p>
@@ -2144,8 +2658,13 @@
         <w:t>Vegitables</w:t>
       </w:r>
       <w:proofErr w:type="spellEnd"/>
-      <w:r>
-        <w:t>',     'Fresh Veggies'),</w:t>
+      <w:proofErr w:type="gramStart"/>
+      <w:r>
+        <w:t xml:space="preserve">',   </w:t>
+      </w:r>
+      <w:proofErr w:type="gramEnd"/>
+      <w:r>
+        <w:t xml:space="preserve">  'Fresh Veggies'),</w:t>
       </w:r>
     </w:p>
     <w:p>
@@ -2197,12 +2716,17 @@
         <w:t xml:space="preserve">    </w:t>
       </w:r>
       <w:proofErr w:type="spellStart"/>
+      <w:proofErr w:type="gramStart"/>
       <w:r>
         <w:t>createdat</w:t>
       </w:r>
       <w:proofErr w:type="spellEnd"/>
       <w:r>
-        <w:t xml:space="preserve">  TIMESTAMP DEFAULT CURRENT_TIMESTAMP,</w:t>
+        <w:t xml:space="preserve">  TIMESTAMP</w:t>
+      </w:r>
+      <w:proofErr w:type="gramEnd"/>
+      <w:r>
+        <w:t xml:space="preserve"> DEFAULT CURRENT_TIMESTAMP,</w:t>
       </w:r>
     </w:p>
     <w:p>
@@ -2260,8 +2784,13 @@
         <w:t xml:space="preserve">CREATE TABLE IF NOT EXISTS </w:t>
       </w:r>
       <w:proofErr w:type="spellStart"/>
-      <w:r>
-        <w:t>public.cart_items</w:t>
+      <w:proofErr w:type="gramStart"/>
+      <w:r>
+        <w:t>public.cart</w:t>
+      </w:r>
+      <w:proofErr w:type="gramEnd"/>
+      <w:r>
+        <w:t>_items</w:t>
       </w:r>
       <w:proofErr w:type="spellEnd"/>
       <w:r>
@@ -2292,11 +2821,19 @@
       </w:r>
       <w:proofErr w:type="spellStart"/>
       <w:r>
-        <w:t>product_id</w:t>
-      </w:r>
-      <w:proofErr w:type="spellEnd"/>
-      <w:r>
-        <w:t xml:space="preserve">  BIGINT,</w:t>
+        <w:t>product_</w:t>
+      </w:r>
+      <w:proofErr w:type="gramStart"/>
+      <w:r>
+        <w:t>id</w:t>
+      </w:r>
+      <w:proofErr w:type="spellEnd"/>
+      <w:r>
+        <w:t xml:space="preserve">  BIGINT</w:t>
+      </w:r>
+      <w:proofErr w:type="gramEnd"/>
+      <w:r>
+        <w:t>,</w:t>
       </w:r>
     </w:p>
     <w:p>
@@ -2310,11 +2847,19 @@
       </w:r>
       <w:proofErr w:type="spellStart"/>
       <w:r>
-        <w:t>cart_id</w:t>
-      </w:r>
-      <w:proofErr w:type="spellEnd"/>
-      <w:r>
-        <w:t xml:space="preserve">)    REFERENCES </w:t>
+        <w:t>cart_</w:t>
+      </w:r>
+      <w:proofErr w:type="gramStart"/>
+      <w:r>
+        <w:t>id</w:t>
+      </w:r>
+      <w:proofErr w:type="spellEnd"/>
+      <w:r>
+        <w:t xml:space="preserve">)   </w:t>
+      </w:r>
+      <w:proofErr w:type="gramEnd"/>
+      <w:r>
+        <w:t xml:space="preserve"> REFERENCES </w:t>
       </w:r>
       <w:proofErr w:type="spellStart"/>
       <w:r>
@@ -2359,8 +2904,13 @@
         <w:t xml:space="preserve">INSERT INTO </w:t>
       </w:r>
       <w:proofErr w:type="spellStart"/>
-      <w:r>
-        <w:t>public.cart_items</w:t>
+      <w:proofErr w:type="gramStart"/>
+      <w:r>
+        <w:t>public.cart</w:t>
+      </w:r>
+      <w:proofErr w:type="gramEnd"/>
+      <w:r>
+        <w:t>_items</w:t>
       </w:r>
       <w:proofErr w:type="spellEnd"/>
       <w:r>
@@ -2414,8 +2964,13 @@
         <w:t xml:space="preserve">CREATE TABLE IF NOT EXISTS </w:t>
       </w:r>
       <w:proofErr w:type="spellStart"/>
-      <w:r>
-        <w:t>public.order_items</w:t>
+      <w:proofErr w:type="gramStart"/>
+      <w:r>
+        <w:t>public.order</w:t>
+      </w:r>
+      <w:proofErr w:type="gramEnd"/>
+      <w:r>
+        <w:t>_items</w:t>
       </w:r>
       <w:proofErr w:type="spellEnd"/>
       <w:r>
@@ -2446,21 +3001,263 @@
       </w:r>
       <w:proofErr w:type="spellStart"/>
       <w:r>
+        <w:t>product_</w:t>
+      </w:r>
+      <w:proofErr w:type="gramStart"/>
+      <w:r>
+        <w:t>id</w:t>
+      </w:r>
+      <w:proofErr w:type="spellEnd"/>
+      <w:r>
+        <w:t xml:space="preserve">  BIGINT</w:t>
+      </w:r>
+      <w:proofErr w:type="gramEnd"/>
+      <w:r>
+        <w:t>,</w:t>
+      </w:r>
+    </w:p>
+    <w:p>
+      <w:r>
+        <w:t xml:space="preserve">    quantity    INT,</w:t>
+      </w:r>
+    </w:p>
+    <w:p>
+      <w:r>
+        <w:t xml:space="preserve">    price       </w:t>
+      </w:r>
+      <w:proofErr w:type="gramStart"/>
+      <w:r>
+        <w:t>DECIMAL(</w:t>
+      </w:r>
+      <w:proofErr w:type="gramEnd"/>
+      <w:r>
+        <w:t>10,2),</w:t>
+      </w:r>
+    </w:p>
+    <w:p>
+      <w:r>
+        <w:t xml:space="preserve">    FOREIGN KEY (</w:t>
+      </w:r>
+      <w:proofErr w:type="spellStart"/>
+      <w:r>
+        <w:t>order_</w:t>
+      </w:r>
+      <w:proofErr w:type="gramStart"/>
+      <w:r>
+        <w:t>id</w:t>
+      </w:r>
+      <w:proofErr w:type="spellEnd"/>
+      <w:r>
+        <w:t xml:space="preserve">)   </w:t>
+      </w:r>
+      <w:proofErr w:type="gramEnd"/>
+      <w:r>
+        <w:t xml:space="preserve">REFERENCES </w:t>
+      </w:r>
+      <w:proofErr w:type="spellStart"/>
+      <w:r>
+        <w:t>public."Orders</w:t>
+      </w:r>
+      <w:proofErr w:type="spellEnd"/>
+      <w:r>
+        <w:t>"(id),</w:t>
+      </w:r>
+    </w:p>
+    <w:p>
+      <w:r>
+        <w:t xml:space="preserve">    FOREIGN KEY (</w:t>
+      </w:r>
+      <w:proofErr w:type="spellStart"/>
+      <w:r>
         <w:t>product_id</w:t>
       </w:r>
       <w:proofErr w:type="spellEnd"/>
       <w:r>
-        <w:t xml:space="preserve">  BIGINT,</w:t>
-      </w:r>
-    </w:p>
-    <w:p>
-      <w:r>
-        <w:t xml:space="preserve">    quantity    INT,</w:t>
-      </w:r>
-    </w:p>
-    <w:p>
-      <w:r>
-        <w:t xml:space="preserve">    price       DECIMAL(10,2),</w:t>
+        <w:t xml:space="preserve">) REFERENCES </w:t>
+      </w:r>
+      <w:proofErr w:type="spellStart"/>
+      <w:r>
+        <w:t>public."Products</w:t>
+      </w:r>
+      <w:proofErr w:type="spellEnd"/>
+      <w:r>
+        <w:t>"(id)</w:t>
+      </w:r>
+    </w:p>
+    <w:p>
+      <w:r>
+        <w:t>);</w:t>
+      </w:r>
+    </w:p>
+    <w:p>
+      <w:r>
+        <w:t xml:space="preserve">create delete endpoint using products, </w:t>
+      </w:r>
+      <w:proofErr w:type="spellStart"/>
+      <w:r>
+        <w:t>roduct_image</w:t>
+      </w:r>
+      <w:proofErr w:type="spellEnd"/>
+      <w:r>
+        <w:t xml:space="preserve"> tables; once particular item soled need to add only available item in </w:t>
+      </w:r>
+      <w:proofErr w:type="spellStart"/>
+      <w:r>
+        <w:t>productavailable</w:t>
+      </w:r>
+      <w:proofErr w:type="spellEnd"/>
+      <w:r>
+        <w:t xml:space="preserve"> table</w:t>
+      </w:r>
+    </w:p>
+    <w:p/>
+    <w:p>
+      <w:r>
+        <w:t xml:space="preserve">INSERT INTO </w:t>
+      </w:r>
+      <w:proofErr w:type="spellStart"/>
+      <w:proofErr w:type="gramStart"/>
+      <w:r>
+        <w:t>public.order</w:t>
+      </w:r>
+      <w:proofErr w:type="gramEnd"/>
+      <w:r>
+        <w:t>_items</w:t>
+      </w:r>
+      <w:proofErr w:type="spellEnd"/>
+      <w:r>
+        <w:t xml:space="preserve"> (</w:t>
+      </w:r>
+      <w:proofErr w:type="spellStart"/>
+      <w:r>
+        <w:t>order_id</w:t>
+      </w:r>
+      <w:proofErr w:type="spellEnd"/>
+      <w:r>
+        <w:t xml:space="preserve">, </w:t>
+      </w:r>
+      <w:proofErr w:type="spellStart"/>
+      <w:r>
+        <w:t>product_id</w:t>
+      </w:r>
+      <w:proofErr w:type="spellEnd"/>
+      <w:r>
+        <w:t>, quantity, price) VALUES</w:t>
+      </w:r>
+    </w:p>
+    <w:p>
+      <w:r>
+        <w:t xml:space="preserve">    (1, 1, 2, 2.00),</w:t>
+      </w:r>
+    </w:p>
+    <w:p>
+      <w:r>
+        <w:t xml:space="preserve">    (1, 3, 6, 5.26),</w:t>
+      </w:r>
+    </w:p>
+    <w:p>
+      <w:r>
+        <w:t xml:space="preserve">    (1, 5, 4, 1.00),</w:t>
+      </w:r>
+    </w:p>
+    <w:p>
+      <w:r>
+        <w:lastRenderedPageBreak/>
+        <w:t xml:space="preserve">    (1, 9, 1, 20.00);</w:t>
+      </w:r>
+    </w:p>
+    <w:p/>
+    <w:p>
+      <w:r>
+        <w:t xml:space="preserve">CREATE TABLE IF NOT EXISTS </w:t>
+      </w:r>
+      <w:proofErr w:type="spellStart"/>
+      <w:proofErr w:type="gramStart"/>
+      <w:r>
+        <w:t>public.payments</w:t>
+      </w:r>
+      <w:proofErr w:type="spellEnd"/>
+      <w:proofErr w:type="gramEnd"/>
+      <w:r>
+        <w:t xml:space="preserve"> (</w:t>
+      </w:r>
+    </w:p>
+    <w:p>
+      <w:r>
+        <w:t xml:space="preserve">    id              BIGINT GENERATED BY DEFAULT AS IDENTITY PRIMARY KEY,</w:t>
+      </w:r>
+    </w:p>
+    <w:p>
+      <w:r>
+        <w:t xml:space="preserve">    </w:t>
+      </w:r>
+      <w:proofErr w:type="spellStart"/>
+      <w:r>
+        <w:t>order_id</w:t>
+      </w:r>
+      <w:proofErr w:type="spellEnd"/>
+      <w:r>
+        <w:t xml:space="preserve">        BIGINT,</w:t>
+      </w:r>
+    </w:p>
+    <w:p>
+      <w:r>
+        <w:t xml:space="preserve">    </w:t>
+      </w:r>
+      <w:proofErr w:type="spellStart"/>
+      <w:r>
+        <w:t>payment_</w:t>
+      </w:r>
+      <w:proofErr w:type="gramStart"/>
+      <w:r>
+        <w:t>method</w:t>
+      </w:r>
+      <w:proofErr w:type="spellEnd"/>
+      <w:r>
+        <w:t xml:space="preserve">  VARCHAR</w:t>
+      </w:r>
+      <w:proofErr w:type="gramEnd"/>
+      <w:r>
+        <w:t>(50),</w:t>
+      </w:r>
+    </w:p>
+    <w:p>
+      <w:r>
+        <w:t xml:space="preserve">    status          </w:t>
+      </w:r>
+      <w:proofErr w:type="gramStart"/>
+      <w:r>
+        <w:t>VARCHAR(</w:t>
+      </w:r>
+      <w:proofErr w:type="gramEnd"/>
+      <w:r>
+        <w:t>50),</w:t>
+      </w:r>
+    </w:p>
+    <w:p>
+      <w:r>
+        <w:t xml:space="preserve">    amount          </w:t>
+      </w:r>
+      <w:proofErr w:type="gramStart"/>
+      <w:r>
+        <w:t>DECIMAL(</w:t>
+      </w:r>
+      <w:proofErr w:type="gramEnd"/>
+      <w:r>
+        <w:t>10,2),</w:t>
+      </w:r>
+    </w:p>
+    <w:p>
+      <w:r>
+        <w:t xml:space="preserve">    </w:t>
+      </w:r>
+      <w:proofErr w:type="spellStart"/>
+      <w:r>
+        <w:t>created_at</w:t>
+      </w:r>
+      <w:proofErr w:type="spellEnd"/>
+      <w:r>
+        <w:t xml:space="preserve">      TIMESTAMP DEFAULT CURRENT_TIMESTAMP,</w:t>
       </w:r>
     </w:p>
     <w:p>
@@ -2473,7 +3270,7 @@
       </w:r>
       <w:proofErr w:type="spellEnd"/>
       <w:r>
-        <w:t xml:space="preserve">)   REFERENCES </w:t>
+        <w:t xml:space="preserve">) REFERENCES </w:t>
       </w:r>
       <w:proofErr w:type="spellStart"/>
       <w:r>
@@ -2481,27 +3278,6 @@
       </w:r>
       <w:proofErr w:type="spellEnd"/>
       <w:r>
-        <w:t>"(id),</w:t>
-      </w:r>
-    </w:p>
-    <w:p>
-      <w:r>
-        <w:t xml:space="preserve">    FOREIGN KEY (</w:t>
-      </w:r>
-      <w:proofErr w:type="spellStart"/>
-      <w:r>
-        <w:t>product_id</w:t>
-      </w:r>
-      <w:proofErr w:type="spellEnd"/>
-      <w:r>
-        <w:t xml:space="preserve">) REFERENCES </w:t>
-      </w:r>
-      <w:proofErr w:type="spellStart"/>
-      <w:r>
-        <w:t>public."Products</w:t>
-      </w:r>
-      <w:proofErr w:type="spellEnd"/>
-      <w:r>
         <w:t>"(id)</w:t>
       </w:r>
     </w:p>
@@ -2511,160 +3287,17 @@
       </w:r>
     </w:p>
     <w:p/>
-    <w:p/>
     <w:p>
       <w:r>
         <w:t xml:space="preserve">INSERT INTO </w:t>
       </w:r>
       <w:proofErr w:type="spellStart"/>
-      <w:r>
-        <w:t>public.order_items</w:t>
-      </w:r>
-      <w:proofErr w:type="spellEnd"/>
-      <w:r>
-        <w:t xml:space="preserve"> (</w:t>
-      </w:r>
-      <w:proofErr w:type="spellStart"/>
-      <w:r>
-        <w:t>order_id</w:t>
-      </w:r>
-      <w:proofErr w:type="spellEnd"/>
-      <w:r>
-        <w:t xml:space="preserve">, </w:t>
-      </w:r>
-      <w:proofErr w:type="spellStart"/>
-      <w:r>
-        <w:t>product_id</w:t>
-      </w:r>
-      <w:proofErr w:type="spellEnd"/>
-      <w:r>
-        <w:t>, quantity, price) VALUES</w:t>
-      </w:r>
-    </w:p>
-    <w:p>
-      <w:r>
-        <w:t xml:space="preserve">    (1, 1, 2, 2.00),</w:t>
-      </w:r>
-    </w:p>
-    <w:p>
-      <w:r>
-        <w:t xml:space="preserve">    (1, 3, 6, 5.26),</w:t>
-      </w:r>
-    </w:p>
-    <w:p>
-      <w:r>
-        <w:t xml:space="preserve">    (1, 5, 4, 1.00),</w:t>
-      </w:r>
-    </w:p>
-    <w:p>
-      <w:r>
-        <w:t xml:space="preserve">    (1, 9, 1, 20.00);</w:t>
-      </w:r>
-    </w:p>
-    <w:p/>
-    <w:p>
-      <w:r>
-        <w:t xml:space="preserve">CREATE TABLE IF NOT EXISTS </w:t>
-      </w:r>
-      <w:proofErr w:type="spellStart"/>
+      <w:proofErr w:type="gramStart"/>
       <w:r>
         <w:t>public.payments</w:t>
       </w:r>
       <w:proofErr w:type="spellEnd"/>
-      <w:r>
-        <w:t xml:space="preserve"> (</w:t>
-      </w:r>
-    </w:p>
-    <w:p>
-      <w:r>
-        <w:t xml:space="preserve">    id              BIGINT GENERATED BY DEFAULT AS IDENTITY PRIMARY KEY,</w:t>
-      </w:r>
-    </w:p>
-    <w:p>
-      <w:r>
-        <w:t xml:space="preserve">    </w:t>
-      </w:r>
-      <w:proofErr w:type="spellStart"/>
-      <w:r>
-        <w:t>order_id</w:t>
-      </w:r>
-      <w:proofErr w:type="spellEnd"/>
-      <w:r>
-        <w:t xml:space="preserve">        BIGINT,</w:t>
-      </w:r>
-    </w:p>
-    <w:p>
-      <w:r>
-        <w:t xml:space="preserve">    </w:t>
-      </w:r>
-      <w:proofErr w:type="spellStart"/>
-      <w:r>
-        <w:t>payment_method</w:t>
-      </w:r>
-      <w:proofErr w:type="spellEnd"/>
-      <w:r>
-        <w:t xml:space="preserve">  VARCHAR(50),</w:t>
-      </w:r>
-    </w:p>
-    <w:p>
-      <w:r>
-        <w:t xml:space="preserve">    status          VARCHAR(50),</w:t>
-      </w:r>
-    </w:p>
-    <w:p>
-      <w:r>
-        <w:t xml:space="preserve">    amount          DECIMAL(10,2),</w:t>
-      </w:r>
-    </w:p>
-    <w:p>
-      <w:r>
-        <w:t xml:space="preserve">    </w:t>
-      </w:r>
-      <w:proofErr w:type="spellStart"/>
-      <w:r>
-        <w:t>created_at</w:t>
-      </w:r>
-      <w:proofErr w:type="spellEnd"/>
-      <w:r>
-        <w:t xml:space="preserve">      TIMESTAMP DEFAULT CURRENT_TIMESTAMP,</w:t>
-      </w:r>
-    </w:p>
-    <w:p>
-      <w:r>
-        <w:t xml:space="preserve">    FOREIGN KEY (</w:t>
-      </w:r>
-      <w:proofErr w:type="spellStart"/>
-      <w:r>
-        <w:t>order_id</w:t>
-      </w:r>
-      <w:proofErr w:type="spellEnd"/>
-      <w:r>
-        <w:t xml:space="preserve">) REFERENCES </w:t>
-      </w:r>
-      <w:proofErr w:type="spellStart"/>
-      <w:r>
-        <w:t>public."Orders</w:t>
-      </w:r>
-      <w:proofErr w:type="spellEnd"/>
-      <w:r>
-        <w:t>"(id)</w:t>
-      </w:r>
-    </w:p>
-    <w:p>
-      <w:r>
-        <w:t>);</w:t>
-      </w:r>
-    </w:p>
-    <w:p/>
-    <w:p>
-      <w:r>
-        <w:t xml:space="preserve">INSERT INTO </w:t>
-      </w:r>
-      <w:proofErr w:type="spellStart"/>
-      <w:r>
-        <w:t>public.payments</w:t>
-      </w:r>
-      <w:proofErr w:type="spellEnd"/>
+      <w:proofErr w:type="gramEnd"/>
       <w:r>
         <w:t xml:space="preserve"> (</w:t>
       </w:r>
@@ -3308,7 +3941,6 @@
   <w:style w:type="character" w:default="1" w:styleId="DefaultParagraphFont">
     <w:name w:val="Default Paragraph Font"/>
     <w:uiPriority w:val="1"/>
-    <w:semiHidden/>
     <w:unhideWhenUsed/>
   </w:style>
   <w:style w:type="table" w:default="1" w:styleId="TableNormal">
@@ -3622,6 +4254,29 @@
       <w:spacing w:val="5"/>
     </w:rPr>
   </w:style>
+  <w:style w:type="character" w:styleId="Hyperlink">
+    <w:name w:val="Hyperlink"/>
+    <w:basedOn w:val="DefaultParagraphFont"/>
+    <w:uiPriority w:val="99"/>
+    <w:unhideWhenUsed/>
+    <w:rsid w:val="002B7911"/>
+    <w:rPr>
+      <w:color w:val="0563C1" w:themeColor="hyperlink"/>
+      <w:u w:val="single"/>
+    </w:rPr>
+  </w:style>
+  <w:style w:type="character" w:styleId="UnresolvedMention">
+    <w:name w:val="Unresolved Mention"/>
+    <w:basedOn w:val="DefaultParagraphFont"/>
+    <w:uiPriority w:val="99"/>
+    <w:semiHidden/>
+    <w:unhideWhenUsed/>
+    <w:rsid w:val="002B7911"/>
+    <w:rPr>
+      <w:color w:val="605E5C"/>
+      <w:shd w:val="clear" w:color="auto" w:fill="E1DFDD"/>
+    </w:rPr>
+  </w:style>
 </w:styles>
 </file>
 

</xml_diff>